<commit_message>
Añade enlaces a los notebooks ejecutados y a las figuras interactivas en los informes
</commit_message>
<xml_diff>
--- a/docs/informes/informe_fase1.docx
+++ b/docs/informes/informe_fase1.docx
@@ -358,7 +358,7 @@
           <w:lang w:val="es-ES"/>
         </w:rPr>
       </w:pPr>
-      <w:bookmarkStart w:id="0" w:name="_Toc243318531"/>
+      <w:bookmarkStart w:id="0" w:name="_Toc243341523"/>
       <w:r>
         <w:rPr>
           <w:lang w:val="es-ES"/>
@@ -840,7 +840,7 @@
         <w:pStyle w:val="Ttulo1"/>
         <w:pageBreakBefore/>
       </w:pPr>
-      <w:bookmarkStart w:id="1" w:name="_Toc243318532"/>
+      <w:bookmarkStart w:id="1" w:name="_Toc243341524"/>
       <w:r>
         <w:lastRenderedPageBreak/>
         <w:t>Índice</w:t>
@@ -854,7 +854,13 @@
           <w:tab w:val="right" w:leader="dot" w:pos="9062"/>
         </w:tabs>
         <w:rPr>
+          <w:rFonts w:asciiTheme="minorHAnsi" w:eastAsiaTheme="minorEastAsia" w:hAnsiTheme="minorHAnsi"/>
           <w:noProof/>
+          <w:kern w:val="2"/>
+          <w:sz w:val="24"/>
+          <w:szCs w:val="24"/>
+          <w:lang w:val="es-ES" w:eastAsia="es-ES"/>
+          <w14:ligatures w14:val="standardContextual"/>
         </w:rPr>
       </w:pPr>
       <w:r>
@@ -866,13 +872,14 @@
       <w:r>
         <w:fldChar w:fldCharType="separate"/>
       </w:r>
-      <w:hyperlink w:anchor="_Toc243318530" w:history="1">
+      <w:hyperlink w:anchor="_Toc243341523" w:history="1">
         <w:r>
           <w:rPr>
             <w:rStyle w:val="Hipervnculo"/>
             <w:noProof/>
+            <w:lang w:val="es-ES"/>
           </w:rPr>
-          <w:t>Respuesta a la revisión anterior</w:t>
+          <w:t>Reparto del trabajo</w:t>
         </w:r>
         <w:r>
           <w:rPr>
@@ -893,7 +900,81 @@
             <w:noProof/>
             <w:webHidden/>
           </w:rPr>
-          <w:instrText xml:space="preserve"> PAGEREF _Toc243318530 \h </w:instrText>
+          <w:instrText xml:space="preserve"> PAGEREF _Toc243341523 \h </w:instrText>
+        </w:r>
+        <w:r>
+          <w:rPr>
+            <w:noProof/>
+            <w:webHidden/>
+          </w:rPr>
+        </w:r>
+        <w:r>
+          <w:rPr>
+            <w:noProof/>
+            <w:webHidden/>
+          </w:rPr>
+          <w:fldChar w:fldCharType="separate"/>
+        </w:r>
+        <w:r>
+          <w:rPr>
+            <w:noProof/>
+            <w:webHidden/>
+          </w:rPr>
+          <w:t>1</w:t>
+        </w:r>
+        <w:r>
+          <w:rPr>
+            <w:noProof/>
+            <w:webHidden/>
+          </w:rPr>
+          <w:fldChar w:fldCharType="end"/>
+        </w:r>
+      </w:hyperlink>
+    </w:p>
+    <w:p>
+      <w:pPr>
+        <w:pStyle w:val="TDC1"/>
+        <w:tabs>
+          <w:tab w:val="right" w:leader="dot" w:pos="9062"/>
+        </w:tabs>
+        <w:rPr>
+          <w:rFonts w:asciiTheme="minorHAnsi" w:eastAsiaTheme="minorEastAsia" w:hAnsiTheme="minorHAnsi"/>
+          <w:noProof/>
+          <w:kern w:val="2"/>
+          <w:sz w:val="24"/>
+          <w:szCs w:val="24"/>
+          <w:lang w:val="es-ES" w:eastAsia="es-ES"/>
+          <w14:ligatures w14:val="standardContextual"/>
+        </w:rPr>
+      </w:pPr>
+      <w:hyperlink w:anchor="_Toc243341524" w:history="1">
+        <w:r>
+          <w:rPr>
+            <w:rStyle w:val="Hipervnculo"/>
+            <w:noProof/>
+          </w:rPr>
+          <w:t>Índice</w:t>
+        </w:r>
+        <w:r>
+          <w:rPr>
+            <w:noProof/>
+            <w:webHidden/>
+          </w:rPr>
+          <w:tab/>
+        </w:r>
+        <w:r>
+          <w:rPr>
+            <w:noProof/>
+            <w:webHidden/>
+          </w:rPr>
+          <w:fldChar w:fldCharType="begin"/>
+        </w:r>
+        <w:r>
+          <w:rPr>
+            <w:noProof/>
+            <w:webHidden/>
+          </w:rPr>
+          <w:instrText xml:space="preserve"> PAGEREF _Toc243341524 \h </w:instrText>
         </w:r>
         <w:r>
           <w:rPr>
@@ -931,16 +1012,23 @@
           <w:tab w:val="right" w:leader="dot" w:pos="9062"/>
         </w:tabs>
         <w:rPr>
+          <w:rFonts w:asciiTheme="minorHAnsi" w:eastAsiaTheme="minorEastAsia" w:hAnsiTheme="minorHAnsi"/>
           <w:noProof/>
+          <w:kern w:val="2"/>
+          <w:sz w:val="24"/>
+          <w:szCs w:val="24"/>
+          <w:lang w:val="es-ES" w:eastAsia="es-ES"/>
+          <w14:ligatures w14:val="standardContextual"/>
         </w:rPr>
       </w:pPr>
-      <w:hyperlink w:anchor="_Toc243318531" w:history="1">
+      <w:hyperlink w:anchor="_Toc243341525" w:history="1">
         <w:r>
           <w:rPr>
             <w:rStyle w:val="Hipervnculo"/>
             <w:noProof/>
+            <w:lang w:val="es-ES"/>
           </w:rPr>
-          <w:t>Reparto del trabajo</w:t>
+          <w:t>1. Introducción</w:t>
         </w:r>
         <w:r>
           <w:rPr>
@@ -961,75 +1049,7 @@
             <w:noProof/>
             <w:webHidden/>
           </w:rPr>
-          <w:instrText xml:space="preserve"> PAGEREF _Toc243318531 \h </w:instrText>
-        </w:r>
-        <w:r>
-          <w:rPr>
-            <w:noProof/>
-            <w:webHidden/>
-          </w:rPr>
-        </w:r>
-        <w:r>
-          <w:rPr>
-            <w:noProof/>
-            <w:webHidden/>
-          </w:rPr>
-          <w:fldChar w:fldCharType="separate"/>
-        </w:r>
-        <w:r>
-          <w:rPr>
-            <w:noProof/>
-            <w:webHidden/>
-          </w:rPr>
-          <w:t>2</w:t>
-        </w:r>
-        <w:r>
-          <w:rPr>
-            <w:noProof/>
-            <w:webHidden/>
-          </w:rPr>
-          <w:fldChar w:fldCharType="end"/>
-        </w:r>
-      </w:hyperlink>
-    </w:p>
-    <w:p>
-      <w:pPr>
-        <w:pStyle w:val="TDC1"/>
-        <w:tabs>
-          <w:tab w:val="right" w:leader="dot" w:pos="9062"/>
-        </w:tabs>
-        <w:rPr>
-          <w:noProof/>
-        </w:rPr>
-      </w:pPr>
-      <w:hyperlink w:anchor="_Toc243318532" w:history="1">
-        <w:r>
-          <w:rPr>
-            <w:rStyle w:val="Hipervnculo"/>
-            <w:noProof/>
-          </w:rPr>
-          <w:t>Índice</w:t>
-        </w:r>
-        <w:r>
-          <w:rPr>
-            <w:noProof/>
-            <w:webHidden/>
-          </w:rPr>
-          <w:tab/>
-        </w:r>
-        <w:r>
-          <w:rPr>
-            <w:noProof/>
-            <w:webHidden/>
-          </w:rPr>
-          <w:fldChar w:fldCharType="begin"/>
-        </w:r>
-        <w:r>
-          <w:rPr>
-            <w:noProof/>
-            <w:webHidden/>
-          </w:rPr>
-          <w:instrText xml:space="preserve"> PAGEREF _Toc243318532 \h </w:instrText>
+          <w:instrText xml:space="preserve"> PAGEREF _Toc243341525 \h </w:instrText>
         </w:r>
         <w:r>
           <w:rPr>
@@ -1067,16 +1087,23 @@
           <w:tab w:val="right" w:leader="dot" w:pos="9062"/>
         </w:tabs>
         <w:rPr>
+          <w:rFonts w:asciiTheme="minorHAnsi" w:eastAsiaTheme="minorEastAsia" w:hAnsiTheme="minorHAnsi"/>
           <w:noProof/>
+          <w:kern w:val="2"/>
+          <w:sz w:val="24"/>
+          <w:szCs w:val="24"/>
+          <w:lang w:val="es-ES" w:eastAsia="es-ES"/>
+          <w14:ligatures w14:val="standardContextual"/>
         </w:rPr>
       </w:pPr>
-      <w:hyperlink w:anchor="_Toc243318533" w:history="1">
+      <w:hyperlink w:anchor="_Toc243341526" w:history="1">
         <w:r>
           <w:rPr>
             <w:rStyle w:val="Hipervnculo"/>
             <w:noProof/>
+            <w:lang w:val="es-ES"/>
           </w:rPr>
-          <w:t>1. Introducción</w:t>
+          <w:t>3. Anotación de datos</w:t>
         </w:r>
         <w:r>
           <w:rPr>
@@ -1097,7 +1124,7 @@
             <w:noProof/>
             <w:webHidden/>
           </w:rPr>
-          <w:instrText xml:space="preserve"> PAGEREF _Toc243318533 \h </w:instrText>
+          <w:instrText xml:space="preserve"> PAGEREF _Toc243341526 \h </w:instrText>
         </w:r>
         <w:r>
           <w:rPr>
@@ -1135,16 +1162,23 @@
           <w:tab w:val="right" w:leader="dot" w:pos="9062"/>
         </w:tabs>
         <w:rPr>
+          <w:rFonts w:asciiTheme="minorHAnsi" w:eastAsiaTheme="minorEastAsia" w:hAnsiTheme="minorHAnsi"/>
           <w:noProof/>
+          <w:kern w:val="2"/>
+          <w:sz w:val="24"/>
+          <w:szCs w:val="24"/>
+          <w:lang w:val="es-ES" w:eastAsia="es-ES"/>
+          <w14:ligatures w14:val="standardContextual"/>
         </w:rPr>
       </w:pPr>
-      <w:hyperlink w:anchor="_Toc243318534" w:history="1">
+      <w:hyperlink w:anchor="_Toc243341527" w:history="1">
         <w:r>
           <w:rPr>
             <w:rStyle w:val="Hipervnculo"/>
             <w:noProof/>
+            <w:lang w:val="es-ES"/>
           </w:rPr>
-          <w:t>2. Recolección de datos</w:t>
+          <w:t>4. Análisis exploratorio de los datos</w:t>
         </w:r>
         <w:r>
           <w:rPr>
@@ -1165,75 +1199,7 @@
             <w:noProof/>
             <w:webHidden/>
           </w:rPr>
-          <w:instrText xml:space="preserve"> PAGEREF _Toc243318534 \h </w:instrText>
-        </w:r>
-        <w:r>
-          <w:rPr>
-            <w:noProof/>
-            <w:webHidden/>
-          </w:rPr>
-        </w:r>
-        <w:r>
-          <w:rPr>
-            <w:noProof/>
-            <w:webHidden/>
-          </w:rPr>
-          <w:fldChar w:fldCharType="separate"/>
-        </w:r>
-        <w:r>
-          <w:rPr>
-            <w:noProof/>
-            <w:webHidden/>
-          </w:rPr>
-          <w:t>4</w:t>
-        </w:r>
-        <w:r>
-          <w:rPr>
-            <w:noProof/>
-            <w:webHidden/>
-          </w:rPr>
-          <w:fldChar w:fldCharType="end"/>
-        </w:r>
-      </w:hyperlink>
-    </w:p>
-    <w:p>
-      <w:pPr>
-        <w:pStyle w:val="TDC1"/>
-        <w:tabs>
-          <w:tab w:val="right" w:leader="dot" w:pos="9062"/>
-        </w:tabs>
-        <w:rPr>
-          <w:noProof/>
-        </w:rPr>
-      </w:pPr>
-      <w:hyperlink w:anchor="_Toc243318535" w:history="1">
-        <w:r>
-          <w:rPr>
-            <w:rStyle w:val="Hipervnculo"/>
-            <w:noProof/>
-          </w:rPr>
-          <w:t>3. Anotación de datos</w:t>
-        </w:r>
-        <w:r>
-          <w:rPr>
-            <w:noProof/>
-            <w:webHidden/>
-          </w:rPr>
-          <w:tab/>
-        </w:r>
-        <w:r>
-          <w:rPr>
-            <w:noProof/>
-            <w:webHidden/>
-          </w:rPr>
-          <w:fldChar w:fldCharType="begin"/>
-        </w:r>
-        <w:r>
-          <w:rPr>
-            <w:noProof/>
-            <w:webHidden/>
-          </w:rPr>
-          <w:instrText xml:space="preserve"> PAGEREF _Toc243318535 \h </w:instrText>
+          <w:instrText xml:space="preserve"> PAGEREF _Toc243341527 \h </w:instrText>
         </w:r>
         <w:r>
           <w:rPr>
@@ -1271,82 +1237,21 @@
           <w:tab w:val="right" w:leader="dot" w:pos="9062"/>
         </w:tabs>
         <w:rPr>
+          <w:rFonts w:asciiTheme="minorHAnsi" w:eastAsiaTheme="minorEastAsia" w:hAnsiTheme="minorHAnsi"/>
           <w:noProof/>
+          <w:kern w:val="2"/>
+          <w:sz w:val="24"/>
+          <w:szCs w:val="24"/>
+          <w:lang w:val="es-ES" w:eastAsia="es-ES"/>
+          <w14:ligatures w14:val="standardContextual"/>
         </w:rPr>
       </w:pPr>
-      <w:hyperlink w:anchor="_Toc243318536" w:history="1">
+      <w:hyperlink w:anchor="_Toc243341528" w:history="1">
         <w:r>
           <w:rPr>
             <w:rStyle w:val="Hipervnculo"/>
             <w:noProof/>
-          </w:rPr>
-          <w:t>4. Análisis exploratorio de los datos</w:t>
-        </w:r>
-        <w:r>
-          <w:rPr>
-            <w:noProof/>
-            <w:webHidden/>
-          </w:rPr>
-          <w:tab/>
-        </w:r>
-        <w:r>
-          <w:rPr>
-            <w:noProof/>
-            <w:webHidden/>
-          </w:rPr>
-          <w:fldChar w:fldCharType="begin"/>
-        </w:r>
-        <w:r>
-          <w:rPr>
-            <w:noProof/>
-            <w:webHidden/>
-          </w:rPr>
-          <w:instrText xml:space="preserve"> PAGEREF _Toc243318536 \h </w:instrText>
-        </w:r>
-        <w:r>
-          <w:rPr>
-            <w:noProof/>
-            <w:webHidden/>
-          </w:rPr>
-        </w:r>
-        <w:r>
-          <w:rPr>
-            <w:noProof/>
-            <w:webHidden/>
-          </w:rPr>
-          <w:fldChar w:fldCharType="separate"/>
-        </w:r>
-        <w:r>
-          <w:rPr>
-            <w:noProof/>
-            <w:webHidden/>
-          </w:rPr>
-          <w:t>6</w:t>
-        </w:r>
-        <w:r>
-          <w:rPr>
-            <w:noProof/>
-            <w:webHidden/>
-          </w:rPr>
-          <w:fldChar w:fldCharType="end"/>
-        </w:r>
-      </w:hyperlink>
-    </w:p>
-    <w:p>
-      <w:pPr>
-        <w:pStyle w:val="TDC1"/>
-        <w:tabs>
-          <w:tab w:val="right" w:leader="dot" w:pos="9062"/>
-        </w:tabs>
-        <w:rPr>
-          <w:noProof/>
-        </w:rPr>
-      </w:pPr>
-      <w:hyperlink w:anchor="_Toc243318537" w:history="1">
-        <w:r>
-          <w:rPr>
-            <w:rStyle w:val="Hipervnculo"/>
-            <w:noProof/>
+            <w:lang w:val="es-ES"/>
           </w:rPr>
           <w:t>5. Aumento de datos</w:t>
         </w:r>
@@ -1369,7 +1274,7 @@
             <w:noProof/>
             <w:webHidden/>
           </w:rPr>
-          <w:instrText xml:space="preserve"> PAGEREF _Toc243318537 \h </w:instrText>
+          <w:instrText xml:space="preserve"> PAGEREF _Toc243341528 \h </w:instrText>
         </w:r>
         <w:r>
           <w:rPr>
@@ -1407,14 +1312,21 @@
           <w:tab w:val="right" w:leader="dot" w:pos="9062"/>
         </w:tabs>
         <w:rPr>
+          <w:rFonts w:asciiTheme="minorHAnsi" w:eastAsiaTheme="minorEastAsia" w:hAnsiTheme="minorHAnsi"/>
           <w:noProof/>
+          <w:kern w:val="2"/>
+          <w:sz w:val="24"/>
+          <w:szCs w:val="24"/>
+          <w:lang w:val="es-ES" w:eastAsia="es-ES"/>
+          <w14:ligatures w14:val="standardContextual"/>
         </w:rPr>
       </w:pPr>
-      <w:hyperlink w:anchor="_Toc243318538" w:history="1">
+      <w:hyperlink w:anchor="_Toc243341529" w:history="1">
         <w:r>
           <w:rPr>
             <w:rStyle w:val="Hipervnculo"/>
             <w:noProof/>
+            <w:lang w:val="es-ES"/>
           </w:rPr>
           <w:t>6. Depuración de datos</w:t>
         </w:r>
@@ -1437,7 +1349,7 @@
             <w:noProof/>
             <w:webHidden/>
           </w:rPr>
-          <w:instrText xml:space="preserve"> PAGEREF _Toc243318538 \h </w:instrText>
+          <w:instrText xml:space="preserve"> PAGEREF _Toc243341529 \h </w:instrText>
         </w:r>
         <w:r>
           <w:rPr>
@@ -1457,7 +1369,7 @@
             <w:noProof/>
             <w:webHidden/>
           </w:rPr>
-          <w:t>10</w:t>
+          <w:t>12</w:t>
         </w:r>
         <w:r>
           <w:rPr>
@@ -1475,14 +1387,21 @@
           <w:tab w:val="right" w:leader="dot" w:pos="9062"/>
         </w:tabs>
         <w:rPr>
+          <w:rFonts w:asciiTheme="minorHAnsi" w:eastAsiaTheme="minorEastAsia" w:hAnsiTheme="minorHAnsi"/>
           <w:noProof/>
+          <w:kern w:val="2"/>
+          <w:sz w:val="24"/>
+          <w:szCs w:val="24"/>
+          <w:lang w:val="es-ES" w:eastAsia="es-ES"/>
+          <w14:ligatures w14:val="standardContextual"/>
         </w:rPr>
       </w:pPr>
-      <w:hyperlink w:anchor="_Toc243318539" w:history="1">
+      <w:hyperlink w:anchor="_Toc243341530" w:history="1">
         <w:r>
           <w:rPr>
             <w:rStyle w:val="Hipervnculo"/>
             <w:noProof/>
+            <w:lang w:val="es-ES"/>
           </w:rPr>
           <w:t>Referencias</w:t>
         </w:r>
@@ -1505,7 +1424,7 @@
             <w:noProof/>
             <w:webHidden/>
           </w:rPr>
-          <w:instrText xml:space="preserve"> PAGEREF _Toc243318539 \h </w:instrText>
+          <w:instrText xml:space="preserve"> PAGEREF _Toc243341530 \h </w:instrText>
         </w:r>
         <w:r>
           <w:rPr>
@@ -1525,7 +1444,7 @@
             <w:noProof/>
             <w:webHidden/>
           </w:rPr>
-          <w:t>11</w:t>
+          <w:t>13</w:t>
         </w:r>
         <w:r>
           <w:rPr>
@@ -1549,7 +1468,7 @@
           <w:lang w:val="es-ES"/>
         </w:rPr>
       </w:pPr>
-      <w:bookmarkStart w:id="2" w:name="_Toc243318533"/>
+      <w:bookmarkStart w:id="2" w:name="_Toc243341525"/>
       <w:r>
         <w:rPr>
           <w:lang w:val="es-ES"/>
@@ -1612,7 +1531,6 @@
         </w:rPr>
         <w:t>E</w:t>
       </w:r>
-      <w:bookmarkStart w:id="3" w:name="_Toc243318534"/>
       <w:r>
         <w:rPr>
           <w:lang w:val="es-ES"/>
@@ -1633,7 +1551,6 @@
         </w:rPr>
         <w:t>2. Recolección de datos</w:t>
       </w:r>
-      <w:bookmarkEnd w:id="3"/>
     </w:p>
     <w:p>
       <w:pPr>
@@ -3642,7 +3559,7 @@
           <w:lang w:val="es-ES"/>
         </w:rPr>
       </w:pPr>
-      <w:bookmarkStart w:id="4" w:name="_Toc243318535"/>
+      <w:bookmarkStart w:id="3" w:name="_Toc243341526"/>
       <w:r>
         <w:rPr>
           <w:lang w:val="es-ES"/>
@@ -3650,7 +3567,7 @@
         <w:lastRenderedPageBreak/>
         <w:t>3. Anotación de datos</w:t>
       </w:r>
-      <w:bookmarkEnd w:id="4"/>
+      <w:bookmarkEnd w:id="3"/>
     </w:p>
     <w:p>
       <w:pPr>
@@ -4284,7 +4201,7 @@
           <w:lang w:val="es-ES"/>
         </w:rPr>
       </w:pPr>
-      <w:bookmarkStart w:id="5" w:name="_Toc243318536"/>
+      <w:bookmarkStart w:id="4" w:name="_Toc243341527"/>
       <w:r>
         <w:rPr>
           <w:lang w:val="es-ES"/>
@@ -4292,7 +4209,7 @@
         <w:lastRenderedPageBreak/>
         <w:t>4. Análisis exploratorio de los datos</w:t>
       </w:r>
-      <w:bookmarkEnd w:id="5"/>
+      <w:bookmarkEnd w:id="4"/>
     </w:p>
     <w:p>
       <w:pPr>
@@ -5399,7 +5316,11 @@
         <w:rPr>
           <w:lang w:val="es-ES"/>
         </w:rPr>
+        <w:lastRenderedPageBreak/>
         <w:t>Las versiones interactivas de las Figuras 5 y 6, publicadas en la web del proyecto [6], incluyen los diez vídeos y 132 ventanas disjuntas de 5 s para comparar todos frente a difficult.</w:t>
+      </w:r>
+      <w:r>
+        <w:t xml:space="preserve"> El notebook ejecutado con el EDA completo (26 celdas de código y sus salidas) está disponible en [7].</w:t>
       </w:r>
     </w:p>
     <w:p>
@@ -5410,7 +5331,7 @@
           <w:lang w:val="es-ES"/>
         </w:rPr>
       </w:pPr>
-      <w:bookmarkStart w:id="6" w:name="_Toc243318537"/>
+      <w:bookmarkStart w:id="5" w:name="_Toc243341528"/>
       <w:r>
         <w:rPr>
           <w:lang w:val="es-ES"/>
@@ -5418,7 +5339,7 @@
         <w:lastRenderedPageBreak/>
         <w:t>5. Aumento de datos</w:t>
       </w:r>
-      <w:bookmarkEnd w:id="6"/>
+      <w:bookmarkEnd w:id="5"/>
     </w:p>
     <w:p>
       <w:pPr>
@@ -8005,6 +7926,11 @@
       </w:r>
     </w:p>
     <w:p>
+      <w:r>
+        <w:t>El notebook ejecutado con el aumento de datos está disponible en [8].</w:t>
+      </w:r>
+    </w:p>
+    <w:p>
       <w:pPr>
         <w:pStyle w:val="Ttulo1"/>
         <w:pageBreakBefore/>
@@ -8012,7 +7938,7 @@
           <w:lang w:val="es-ES"/>
         </w:rPr>
       </w:pPr>
-      <w:bookmarkStart w:id="7" w:name="_Toc243318538"/>
+      <w:bookmarkStart w:id="6" w:name="_Toc243341529"/>
       <w:r>
         <w:rPr>
           <w:lang w:val="es-ES"/>
@@ -8020,7 +7946,7 @@
         <w:lastRenderedPageBreak/>
         <w:t>6. Depuración de datos</w:t>
       </w:r>
-      <w:bookmarkEnd w:id="7"/>
+      <w:bookmarkEnd w:id="6"/>
     </w:p>
     <w:p>
       <w:pPr>
@@ -8647,7 +8573,7 @@
           <w:lang w:val="es-ES"/>
         </w:rPr>
       </w:pPr>
-      <w:bookmarkStart w:id="8" w:name="_Toc243318539"/>
+      <w:bookmarkStart w:id="7" w:name="_Toc243341530"/>
       <w:r>
         <w:rPr>
           <w:lang w:val="es-ES"/>
@@ -8655,7 +8581,7 @@
         <w:lastRenderedPageBreak/>
         <w:t>Referencias</w:t>
       </w:r>
-      <w:bookmarkEnd w:id="8"/>
+      <w:bookmarkEnd w:id="7"/>
     </w:p>
     <w:p>
       <w:pPr>
@@ -8732,35 +8658,51 @@
         </w:rPr>
       </w:pPr>
       <w:r>
-        <w:rPr>
-          <w:lang w:val="es-ES"/>
-        </w:rPr>
-        <w:t>[6] Web del proyecto</w:t>
+        <w:t xml:space="preserve">[6] Web del proyecto interactiva. </w:t>
       </w:r>
+      <w:hyperlink r:id="rId16">
+        <w:r>
+          <w:rPr>
+            <w:color w:val="0563C1"/>
+            <w:u w:val="single"/>
+          </w:rPr>
+          <w:t>https://javiersaguar.github.io/PIDS-Proyecto2/</w:t>
+        </w:r>
+      </w:hyperlink>
+    </w:p>
+    <w:p>
+      <w:pPr>
+        <w:jc w:val="left"/>
+      </w:pPr>
       <w:r>
-        <w:rPr>
-          <w:lang w:val="es-ES"/>
-        </w:rPr>
-        <w:t xml:space="preserve"> </w:t>
+        <w:t xml:space="preserve">[7] Notebook del EDA ejecutado (eda.ipynb). </w:t>
       </w:r>
+      <w:hyperlink r:id="rId17">
+        <w:r>
+          <w:rPr>
+            <w:color w:val="0563C1"/>
+            <w:u w:val="single"/>
+          </w:rPr>
+          <w:t>https://htmlpreview.github.io/?https://github.com/javiersaguar/PIDS-Proyecto2/blob/main/ENTREGA%201/WEEK1/eda.html</w:t>
+        </w:r>
+      </w:hyperlink>
+    </w:p>
+    <w:p>
+      <w:pPr>
+        <w:jc w:val="left"/>
+      </w:pPr>
       <w:r>
-        <w:rPr>
-          <w:lang w:val="es-ES"/>
-        </w:rPr>
-        <w:t>interactiv</w:t>
+        <w:t xml:space="preserve">[8] Notebook del aumento de datos ejecutado (data_aug.ipynb). </w:t>
       </w:r>
-      <w:r>
-        <w:rPr>
-          <w:lang w:val="es-ES"/>
-        </w:rPr>
-        <w:t>a</w:t>
-      </w:r>
-      <w:r>
-        <w:rPr>
-          <w:lang w:val="es-ES"/>
-        </w:rPr>
-        <w:t>. https://javiersaguar.github.io/PIDS-Proyecto2/</w:t>
-      </w:r>
+      <w:hyperlink r:id="rId18">
+        <w:r>
+          <w:rPr>
+            <w:color w:val="0563C1"/>
+            <w:u w:val="single"/>
+          </w:rPr>
+          <w:t>https://htmlpreview.github.io/?https://github.com/javiersaguar/PIDS-Proyecto2/blob/main/ENTREGA%201/WEEK1/data_aug.html</w:t>
+        </w:r>
+      </w:hyperlink>
     </w:p>
     <w:p>
       <w:pPr>
@@ -8776,8 +8718,8 @@
       </w:r>
     </w:p>
     <w:sectPr>
-      <w:headerReference w:type="default" r:id="rId16"/>
-      <w:footerReference w:type="default" r:id="rId17"/>
+      <w:headerReference w:type="default" r:id="rId19"/>
+      <w:footerReference w:type="default" r:id="rId20"/>
       <w:pgSz w:w="11906" w:h="16838"/>
       <w:pgMar w:top="1247" w:right="1417" w:bottom="1247" w:left="1417" w:header="680" w:footer="680" w:gutter="0"/>
       <w:cols w:space="720"/>
@@ -9792,6 +9734,7 @@
   <w:style w:type="character" w:default="1" w:styleId="Fuentedeprrafopredeter">
     <w:name w:val="Default Paragraph Font"/>
     <w:uiPriority w:val="1"/>
+    <w:semiHidden/>
     <w:unhideWhenUsed/>
   </w:style>
   <w:style w:type="table" w:default="1" w:styleId="Tablanormal">

</xml_diff>

<commit_message>
Corrige la memoria de la fase 1 y quita el zip de entrega del repositorio
- Quita PIDS_bloque1_entrega.zip y la regla *.zip de Git LFS, que afectaba
  también a los zips de los vídeos.
- Portada: fecha de entrega 20/10/2026 y reparto del trabajo acordado en el grupo.
- «2. Recolección de datos» como encabezado de primer nivel, para que salga en el índice.
- Numeración de la tabla de depuración (Tabla 9) y referencia [9] a video2frames.ipynb.
- PDF exportado desde Word con el índice actualizado: 13 páginas, 10 de cuerpo.
</commit_message>
<xml_diff>
--- a/docs/informes/informe_fase1.docx
+++ b/docs/informes/informe_fase1.docx
@@ -340,7 +340,7 @@
               <w:rPr>
                 <w:sz w:val="20"/>
               </w:rPr>
-              <w:t>Pendiente de confirmación</w:t>
+              <w:t>20/10/2026</w:t>
             </w:r>
           </w:p>
         </w:tc>
@@ -358,7 +358,7 @@
           <w:lang w:val="es-ES"/>
         </w:rPr>
       </w:pPr>
-      <w:bookmarkStart w:id="0" w:name="_Toc243341523"/>
+      <w:bookmarkStart w:id="0" w:name="_Toc243417775"/>
       <w:r>
         <w:rPr>
           <w:lang w:val="es-ES"/>
@@ -512,13 +512,7 @@
                 <w:sz w:val="18"/>
                 <w:lang w:val="es-ES"/>
               </w:rPr>
-              <w:t xml:space="preserve">Lote A (vídeos 01-02): extracción, anotación y revisión cruzada. </w:t>
-            </w:r>
-            <w:r>
-              <w:rPr>
-                <w:sz w:val="18"/>
-              </w:rPr>
-              <w:t>Organización del repositorio y fichas de los vídeos.</w:t>
+              <w:t>Lote A (vídeos 01-02): extracción, anotación y revisión cruzada. Fichas de los vídeos, criterios de anotación y depuración del dataset. Aumento de datos sobre el script de Alejandro, que mejoró y ejecutó. Redacción de la memoria.</w:t>
             </w:r>
           </w:p>
         </w:tc>
@@ -586,13 +580,7 @@
                 <w:sz w:val="18"/>
                 <w:lang w:val="es-ES"/>
               </w:rPr>
-              <w:t xml:space="preserve">Lote B (vídeos 03-04): extracción, anotación y revisión cruzada. </w:t>
-            </w:r>
-            <w:r>
-              <w:rPr>
-                <w:sz w:val="18"/>
-              </w:rPr>
-              <w:t>Análisis exploratorio de los datos (EDA).</w:t>
+              <w:t>Lote B (vídeos 03-04): extracción, anotación y revisión cruzada. Análisis exploratorio de los datos (EDA) y script de entrenamiento sobre el que se integró el aumento. Redacción de la memoria.</w:t>
             </w:r>
           </w:p>
         </w:tc>
@@ -660,13 +648,7 @@
                 <w:sz w:val="18"/>
                 <w:lang w:val="es-ES"/>
               </w:rPr>
-              <w:t xml:space="preserve">Lote C (vídeos 05-06): extracción, anotación y revisión cruzada. </w:t>
-            </w:r>
-            <w:r>
-              <w:rPr>
-                <w:sz w:val="18"/>
-              </w:rPr>
-              <w:t>Calibración y criterios de anotación.</w:t>
+              <w:t>Lote C (vídeos 05-06): extracción, anotación y revisión cruzada. Calibración entre anotadores y revisión de la memoria.</w:t>
             </w:r>
           </w:p>
         </w:tc>
@@ -734,13 +716,7 @@
                 <w:sz w:val="18"/>
                 <w:lang w:val="es-ES"/>
               </w:rPr>
-              <w:t xml:space="preserve">Lote D (vídeos 07-08): extracción, anotación y revisión cruzada. </w:t>
-            </w:r>
-            <w:r>
-              <w:rPr>
-                <w:sz w:val="18"/>
-              </w:rPr>
-              <w:t>Aumento de datos.</w:t>
+              <w:t>Lote D (vídeos 07-08): extracción, anotación y revisión cruzada. Calibración, selección de figuras del EDA y diseño de la web de figuras interactivas (GitHub Pages).</w:t>
             </w:r>
           </w:p>
         </w:tc>
@@ -808,13 +784,7 @@
                 <w:sz w:val="18"/>
                 <w:lang w:val="es-ES"/>
               </w:rPr>
-              <w:t xml:space="preserve">Lote E (vídeos 09-10): extracción, anotación y revisión cruzada. </w:t>
-            </w:r>
-            <w:r>
-              <w:rPr>
-                <w:sz w:val="18"/>
-              </w:rPr>
-              <w:t>Depuración del dataset.</w:t>
+              <w:t>Lote E (vídeos 09-10): extracción, anotación y revisión cruzada. Calibración y redacción de la memoria.</w:t>
             </w:r>
           </w:p>
         </w:tc>
@@ -840,7 +810,7 @@
         <w:pStyle w:val="Ttulo1"/>
         <w:pageBreakBefore/>
       </w:pPr>
-      <w:bookmarkStart w:id="1" w:name="_Toc243341524"/>
+      <w:bookmarkStart w:id="1" w:name="_Toc243417776"/>
       <w:r>
         <w:lastRenderedPageBreak/>
         <w:t>Índice</w:t>
@@ -872,7 +842,7 @@
       <w:r>
         <w:fldChar w:fldCharType="separate"/>
       </w:r>
-      <w:hyperlink w:anchor="_Toc243341523" w:history="1">
+      <w:hyperlink w:anchor="_Toc243417775" w:history="1">
         <w:r>
           <w:rPr>
             <w:rStyle w:val="Hipervnculo"/>
@@ -900,7 +870,7 @@
             <w:noProof/>
             <w:webHidden/>
           </w:rPr>
-          <w:instrText xml:space="preserve"> PAGEREF _Toc243341523 \h </w:instrText>
+          <w:instrText xml:space="preserve"> PAGEREF _Toc243417775 \h </w:instrText>
         </w:r>
         <w:r>
           <w:rPr>
@@ -947,7 +917,7 @@
           <w14:ligatures w14:val="standardContextual"/>
         </w:rPr>
       </w:pPr>
-      <w:hyperlink w:anchor="_Toc243341524" w:history="1">
+      <w:hyperlink w:anchor="_Toc243417776" w:history="1">
         <w:r>
           <w:rPr>
             <w:rStyle w:val="Hipervnculo"/>
@@ -974,7 +944,7 @@
             <w:noProof/>
             <w:webHidden/>
           </w:rPr>
-          <w:instrText xml:space="preserve"> PAGEREF _Toc243341524 \h </w:instrText>
+          <w:instrText xml:space="preserve"> PAGEREF _Toc243417776 \h </w:instrText>
         </w:r>
         <w:r>
           <w:rPr>
@@ -1021,7 +991,7 @@
           <w14:ligatures w14:val="standardContextual"/>
         </w:rPr>
       </w:pPr>
-      <w:hyperlink w:anchor="_Toc243341525" w:history="1">
+      <w:hyperlink w:anchor="_Toc243417777" w:history="1">
         <w:r>
           <w:rPr>
             <w:rStyle w:val="Hipervnculo"/>
@@ -1049,7 +1019,7 @@
             <w:noProof/>
             <w:webHidden/>
           </w:rPr>
-          <w:instrText xml:space="preserve"> PAGEREF _Toc243341525 \h </w:instrText>
+          <w:instrText xml:space="preserve"> PAGEREF _Toc243417777 \h </w:instrText>
         </w:r>
         <w:r>
           <w:rPr>
@@ -1096,7 +1066,82 @@
           <w14:ligatures w14:val="standardContextual"/>
         </w:rPr>
       </w:pPr>
-      <w:hyperlink w:anchor="_Toc243341526" w:history="1">
+      <w:hyperlink w:anchor="_Toc243417778" w:history="1">
+        <w:r>
+          <w:rPr>
+            <w:rStyle w:val="Hipervnculo"/>
+            <w:noProof/>
+            <w:lang w:val="es-ES"/>
+          </w:rPr>
+          <w:t>2. Recolección de datos</w:t>
+        </w:r>
+        <w:r>
+          <w:rPr>
+            <w:noProof/>
+            <w:webHidden/>
+          </w:rPr>
+          <w:tab/>
+        </w:r>
+        <w:r>
+          <w:rPr>
+            <w:noProof/>
+            <w:webHidden/>
+          </w:rPr>
+          <w:fldChar w:fldCharType="begin"/>
+        </w:r>
+        <w:r>
+          <w:rPr>
+            <w:noProof/>
+            <w:webHidden/>
+          </w:rPr>
+          <w:instrText xml:space="preserve"> PAGEREF _Toc243417778 \h </w:instrText>
+        </w:r>
+        <w:r>
+          <w:rPr>
+            <w:noProof/>
+            <w:webHidden/>
+          </w:rPr>
+        </w:r>
+        <w:r>
+          <w:rPr>
+            <w:noProof/>
+            <w:webHidden/>
+          </w:rPr>
+          <w:fldChar w:fldCharType="separate"/>
+        </w:r>
+        <w:r>
+          <w:rPr>
+            <w:noProof/>
+            <w:webHidden/>
+          </w:rPr>
+          <w:t>3</w:t>
+        </w:r>
+        <w:r>
+          <w:rPr>
+            <w:noProof/>
+            <w:webHidden/>
+          </w:rPr>
+          <w:fldChar w:fldCharType="end"/>
+        </w:r>
+      </w:hyperlink>
+    </w:p>
+    <w:p>
+      <w:pPr>
+        <w:pStyle w:val="TDC1"/>
+        <w:tabs>
+          <w:tab w:val="right" w:leader="dot" w:pos="9062"/>
+        </w:tabs>
+        <w:rPr>
+          <w:rFonts w:asciiTheme="minorHAnsi" w:eastAsiaTheme="minorEastAsia" w:hAnsiTheme="minorHAnsi"/>
+          <w:noProof/>
+          <w:kern w:val="2"/>
+          <w:sz w:val="24"/>
+          <w:szCs w:val="24"/>
+          <w:lang w:val="es-ES" w:eastAsia="es-ES"/>
+          <w14:ligatures w14:val="standardContextual"/>
+        </w:rPr>
+      </w:pPr>
+      <w:hyperlink w:anchor="_Toc243417779" w:history="1">
         <w:r>
           <w:rPr>
             <w:rStyle w:val="Hipervnculo"/>
@@ -1124,7 +1169,7 @@
             <w:noProof/>
             <w:webHidden/>
           </w:rPr>
-          <w:instrText xml:space="preserve"> PAGEREF _Toc243341526 \h </w:instrText>
+          <w:instrText xml:space="preserve"> PAGEREF _Toc243417779 \h </w:instrText>
         </w:r>
         <w:r>
           <w:rPr>
@@ -1171,7 +1216,7 @@
           <w14:ligatures w14:val="standardContextual"/>
         </w:rPr>
       </w:pPr>
-      <w:hyperlink w:anchor="_Toc243341527" w:history="1">
+      <w:hyperlink w:anchor="_Toc243417780" w:history="1">
         <w:r>
           <w:rPr>
             <w:rStyle w:val="Hipervnculo"/>
@@ -1199,7 +1244,7 @@
             <w:noProof/>
             <w:webHidden/>
           </w:rPr>
-          <w:instrText xml:space="preserve"> PAGEREF _Toc243341527 \h </w:instrText>
+          <w:instrText xml:space="preserve"> PAGEREF _Toc243417780 \h </w:instrText>
         </w:r>
         <w:r>
           <w:rPr>
@@ -1246,7 +1291,7 @@
           <w14:ligatures w14:val="standardContextual"/>
         </w:rPr>
       </w:pPr>
-      <w:hyperlink w:anchor="_Toc243341528" w:history="1">
+      <w:hyperlink w:anchor="_Toc243417781" w:history="1">
         <w:r>
           <w:rPr>
             <w:rStyle w:val="Hipervnculo"/>
@@ -1274,7 +1319,7 @@
             <w:noProof/>
             <w:webHidden/>
           </w:rPr>
-          <w:instrText xml:space="preserve"> PAGEREF _Toc243341528 \h </w:instrText>
+          <w:instrText xml:space="preserve"> PAGEREF _Toc243417781 \h </w:instrText>
         </w:r>
         <w:r>
           <w:rPr>
@@ -1321,7 +1366,7 @@
           <w14:ligatures w14:val="standardContextual"/>
         </w:rPr>
       </w:pPr>
-      <w:hyperlink w:anchor="_Toc243341529" w:history="1">
+      <w:hyperlink w:anchor="_Toc243417782" w:history="1">
         <w:r>
           <w:rPr>
             <w:rStyle w:val="Hipervnculo"/>
@@ -1349,7 +1394,7 @@
             <w:noProof/>
             <w:webHidden/>
           </w:rPr>
-          <w:instrText xml:space="preserve"> PAGEREF _Toc243341529 \h </w:instrText>
+          <w:instrText xml:space="preserve"> PAGEREF _Toc243417782 \h </w:instrText>
         </w:r>
         <w:r>
           <w:rPr>
@@ -1396,7 +1441,7 @@
           <w14:ligatures w14:val="standardContextual"/>
         </w:rPr>
       </w:pPr>
-      <w:hyperlink w:anchor="_Toc243341530" w:history="1">
+      <w:hyperlink w:anchor="_Toc243417783" w:history="1">
         <w:r>
           <w:rPr>
             <w:rStyle w:val="Hipervnculo"/>
@@ -1424,7 +1469,7 @@
             <w:noProof/>
             <w:webHidden/>
           </w:rPr>
-          <w:instrText xml:space="preserve"> PAGEREF _Toc243341530 \h </w:instrText>
+          <w:instrText xml:space="preserve"> PAGEREF _Toc243417783 \h </w:instrText>
         </w:r>
         <w:r>
           <w:rPr>
@@ -1468,7 +1513,7 @@
           <w:lang w:val="es-ES"/>
         </w:rPr>
       </w:pPr>
-      <w:bookmarkStart w:id="2" w:name="_Toc243341525"/>
+      <w:bookmarkStart w:id="2" w:name="_Toc243417777"/>
       <w:r>
         <w:rPr>
           <w:lang w:val="es-ES"/>
@@ -1540,17 +1585,19 @@
     </w:p>
     <w:p>
       <w:pPr>
-        <w:pStyle w:val="Ttulo2"/>
+        <w:pStyle w:val="Ttulo1"/>
         <w:rPr>
           <w:lang w:val="es-ES"/>
         </w:rPr>
       </w:pPr>
+      <w:bookmarkStart w:id="3" w:name="_Toc243417778"/>
       <w:r>
         <w:rPr>
           <w:lang w:val="es-ES"/>
         </w:rPr>
         <w:t>2. Recolección de datos</w:t>
       </w:r>
+      <w:bookmarkEnd w:id="3"/>
     </w:p>
     <w:p>
       <w:pPr>
@@ -3548,7 +3595,7 @@
         <w:rPr>
           <w:lang w:val="es-ES"/>
         </w:rPr>
-        <w:t>Tabla 2. Grabaciones propias y número exacto de imágenes extraídas.</w:t>
+        <w:t>Tabla 2. Grabaciones propias y número exacto de imágenes extraídas con video2frames.ipynb [9].</w:t>
       </w:r>
     </w:p>
     <w:p>
@@ -3559,7 +3606,7 @@
           <w:lang w:val="es-ES"/>
         </w:rPr>
       </w:pPr>
-      <w:bookmarkStart w:id="3" w:name="_Toc243341526"/>
+      <w:bookmarkStart w:id="4" w:name="_Toc243417779"/>
       <w:r>
         <w:rPr>
           <w:lang w:val="es-ES"/>
@@ -3567,7 +3614,7 @@
         <w:lastRenderedPageBreak/>
         <w:t>3. Anotación de datos</w:t>
       </w:r>
-      <w:bookmarkEnd w:id="3"/>
+      <w:bookmarkEnd w:id="4"/>
     </w:p>
     <w:p>
       <w:pPr>
@@ -4201,7 +4248,7 @@
           <w:lang w:val="es-ES"/>
         </w:rPr>
       </w:pPr>
-      <w:bookmarkStart w:id="4" w:name="_Toc243341527"/>
+      <w:bookmarkStart w:id="5" w:name="_Toc243417780"/>
       <w:r>
         <w:rPr>
           <w:lang w:val="es-ES"/>
@@ -4209,7 +4256,7 @@
         <w:lastRenderedPageBreak/>
         <w:t>4. Análisis exploratorio de los datos</w:t>
       </w:r>
-      <w:bookmarkEnd w:id="4"/>
+      <w:bookmarkEnd w:id="5"/>
     </w:p>
     <w:p>
       <w:pPr>
@@ -5331,7 +5378,7 @@
           <w:lang w:val="es-ES"/>
         </w:rPr>
       </w:pPr>
-      <w:bookmarkStart w:id="5" w:name="_Toc243341528"/>
+      <w:bookmarkStart w:id="6" w:name="_Toc243417781"/>
       <w:r>
         <w:rPr>
           <w:lang w:val="es-ES"/>
@@ -5339,7 +5386,7 @@
         <w:lastRenderedPageBreak/>
         <w:t>5. Aumento de datos</w:t>
       </w:r>
-      <w:bookmarkEnd w:id="5"/>
+      <w:bookmarkEnd w:id="6"/>
     </w:p>
     <w:p>
       <w:pPr>
@@ -7938,7 +7985,7 @@
           <w:lang w:val="es-ES"/>
         </w:rPr>
       </w:pPr>
-      <w:bookmarkStart w:id="6" w:name="_Toc243341529"/>
+      <w:bookmarkStart w:id="7" w:name="_Toc243417782"/>
       <w:r>
         <w:rPr>
           <w:lang w:val="es-ES"/>
@@ -7946,7 +7993,7 @@
         <w:lastRenderedPageBreak/>
         <w:t>6. Depuración de datos</w:t>
       </w:r>
-      <w:bookmarkEnd w:id="6"/>
+      <w:bookmarkEnd w:id="7"/>
     </w:p>
     <w:p>
       <w:pPr>
@@ -8496,7 +8543,7 @@
         <w:rPr>
           <w:lang w:val="es-ES"/>
         </w:rPr>
-        <w:t>Tabla 6. Efecto de la depuración y del aumento base.</w:t>
+        <w:t>Tabla 9. Efecto de la depuración y del aumento base.</w:t>
       </w:r>
     </w:p>
     <w:p>
@@ -8573,7 +8620,7 @@
           <w:lang w:val="es-ES"/>
         </w:rPr>
       </w:pPr>
-      <w:bookmarkStart w:id="7" w:name="_Toc243341530"/>
+      <w:bookmarkStart w:id="8" w:name="_Toc243417783"/>
       <w:r>
         <w:rPr>
           <w:lang w:val="es-ES"/>
@@ -8581,7 +8628,7 @@
         <w:lastRenderedPageBreak/>
         <w:t>Referencias</w:t>
       </w:r>
-      <w:bookmarkEnd w:id="7"/>
+      <w:bookmarkEnd w:id="8"/>
     </w:p>
     <w:p>
       <w:pPr>
@@ -8706,6 +8753,23 @@
     </w:p>
     <w:p>
       <w:pPr>
+        <w:jc w:val="left"/>
+      </w:pPr>
+      <w:r>
+        <w:t xml:space="preserve">[9] Notebook de extracción de fotogramas (video2frames.ipynb). </w:t>
+      </w:r>
+      <w:hyperlink r:id="rId19">
+        <w:r>
+          <w:rPr>
+            <w:color w:val="0563C1"/>
+            <w:u w:val="single"/>
+          </w:rPr>
+          <w:t>https://github.com/javiersaguar/PIDS-Proyecto2/blob/main/ENTREGA%201/WEEK1/video2frames.ipynb</w:t>
+        </w:r>
+      </w:hyperlink>
+    </w:p>
+    <w:p>
+      <w:pPr>
         <w:rPr>
           <w:lang w:val="es-ES"/>
         </w:rPr>
@@ -8718,8 +8782,8 @@
       </w:r>
     </w:p>
     <w:sectPr>
-      <w:headerReference w:type="default" r:id="rId19"/>
-      <w:footerReference w:type="default" r:id="rId20"/>
+      <w:headerReference w:type="default" r:id="rId20"/>
+      <w:footerReference w:type="default" r:id="rId21"/>
       <w:pgSz w:w="11906" w:h="16838"/>
       <w:pgMar w:top="1247" w:right="1417" w:bottom="1247" w:left="1417" w:header="680" w:footer="680" w:gutter="0"/>
       <w:cols w:space="720"/>

</xml_diff>